<commit_message>
Restore Dr. Naeem's original IRB files; deliver Attachments C and D as separate documents
Revert the prior in-place edits to the two author-provided files, returning them
to their original content (verified: 107/1 and 118/2 paragraph/table counts, all
additions and styling removed). Provide the required instruments as new,
self-contained, professionally styled files instead of modifying the originals:

- IRB/Attachment_C_Lay_Reader_Survey_Instrument.docx
- IRB/Attachment_D_Expert_Accuracy_and_Completeness_Rubric.docx
- IRB/Recommended_corrections_to_existing_attachments.docx (advisory memo for the
  three inconsistencies noted, applied to nothing)
</commit_message>
<xml_diff>
--- a/IRB/cardiac_readability_IRB_proposal.docx
+++ b/IRB/cardiac_readability_IRB_proposal.docx
@@ -4,32 +4,24 @@
   <w:body>
     <w:p>
       <w:pPr>
-        <w:spacing w:after="80"/>
+        <w:spacing/>
         <w:jc w:val="center"/>
       </w:pPr>
       <w:r>
         <w:rPr>
-          <w:b/>
           <w:bCs/>
-          <w:color w:val="1F4E79"/>
-          <w:sz w:val="22"/>
           <w:szCs w:val="32"/>
-          <w:caps w:val="true"/>
-          <w:spacing w:val="60"/>
         </w:rPr>
         <w:t>IRB Application</w:t>
       </w:r>
     </w:p>
     <w:p>
       <w:pPr>
-        <w:spacing w:after="60"/>
+        <w:spacing/>
         <w:jc w:val="center"/>
       </w:pPr>
       <w:r>
         <w:rPr>
-          <w:b/>
-          <w:color w:val="1A1A1A"/>
-          <w:sz w:val="30"/>
           <w:szCs w:val="24"/>
         </w:rPr>
         <w:t>Readability of Online Patient Education Materials for Pre-Procedure Cardiac CT, With an Artificial Intelligence Rewrite Arm and Lay Reader Assessment</w:t>
@@ -37,27 +29,18 @@
     </w:p>
     <w:p>
       <w:pPr>
-        <w:spacing w:after="200"/>
+        <w:spacing/>
         <w:jc w:val="center"/>
-        <w:pBdr>
-          <w:bottom w:val="single" w:sz="6" w:space="6" w:color="1F4E79"/>
-        </w:pBdr>
       </w:pPr>
       <w:r>
         <w:rPr>
-          <w:i/>
           <w:iCs/>
-          <w:color w:val="595959"/>
-          <w:sz w:val="22"/>
         </w:rPr>
         <w:t>Principal Investigator: Naeem</w:t>
       </w:r>
       <w:r>
         <w:rPr>
-          <w:i/>
           <w:iCs/>
-          <w:color w:val="595959"/>
-          <w:sz w:val="22"/>
         </w:rPr>
         <w:t>, Muhammad, MBBS, MD</w:t>
       </w:r>
@@ -73,21 +56,6 @@
     <w:tbl>
       <w:tblPr>
         <w:tblLook w:val="0000" w:firstRow="0" w:lastRow="0" w:firstColumn="0" w:lastColumn="0" w:noHBand="0" w:noVBand="0"/>
-        <w:tblBorders>
-          <w:top w:val="single" w:sz="4" w:space="0" w:color="B7C4D4"/>
-          <w:left w:val="single" w:sz="4" w:space="0" w:color="B7C4D4"/>
-          <w:bottom w:val="single" w:sz="4" w:space="0" w:color="B7C4D4"/>
-          <w:right w:val="single" w:sz="4" w:space="0" w:color="B7C4D4"/>
-          <w:insideH w:val="single" w:sz="4" w:space="0" w:color="B7C4D4"/>
-          <w:insideV w:val="single" w:sz="4" w:space="0" w:color="B7C4D4"/>
-        </w:tblBorders>
-        <w:tblCellMar>
-          <w:top w:w="60" w:type="dxa"/>
-          <w:bottom w:w="60" w:type="dxa"/>
-          <w:left w:w="108" w:type="dxa"/>
-          <w:right w:w="108" w:type="dxa"/>
-        </w:tblCellMar>
-        <w:tblW w:w="5000" w:type="pct"/>
       </w:tblPr>
       <w:tblGrid>
         <w:gridCol w:w="2800"/>
@@ -100,9 +68,7 @@
             <w:bottom w:w="0" w:type="dxa"/>
           </w:tblCellMar>
         </w:tblPrEx>
-        <w:trPr>
-          <w:tblHeader w:val="true"/>
-        </w:trPr>
+        <w:trPr/>
         <w:tc>
           <w:tcPr>
             <w:tcW w:w="2800" w:type="dxa"/>
@@ -118,7 +84,6 @@
               <w:bottom w:w="80" w:type="dxa"/>
               <w:right w:w="120" w:type="dxa"/>
             </w:tcMar>
-            <w:shd w:val="clear" w:color="auto" w:fill="1F4E79"/>
             <w:vAlign w:val="center"/>
           </w:tcPr>
           <w:p>
@@ -127,10 +92,7 @@
             </w:pPr>
             <w:r>
               <w:rPr>
-                <w:b/>
                 <w:bCs/>
-                <w:color w:val="FFFFFF"/>
-                <w:sz w:val="21"/>
               </w:rPr>
               <w:t>Item</w:t>
             </w:r>
@@ -151,7 +113,6 @@
               <w:bottom w:w="80" w:type="dxa"/>
               <w:right w:w="120" w:type="dxa"/>
             </w:tcMar>
-            <w:shd w:val="clear" w:color="auto" w:fill="1F4E79"/>
             <w:vAlign w:val="center"/>
           </w:tcPr>
           <w:p>
@@ -160,10 +121,7 @@
             </w:pPr>
             <w:r>
               <w:rPr>
-                <w:b/>
                 <w:bCs/>
-                <w:color w:val="FFFFFF"/>
-                <w:sz w:val="21"/>
               </w:rPr>
               <w:t>Detail</w:t>
             </w:r>
@@ -196,9 +154,7 @@
           </w:tcPr>
           <w:p>
             <w:r>
-              <w:rPr>
-                <w:b/>
-              </w:rPr>
+              <w:rPr/>
               <w:t>Principal Investigator</w:t>
             </w:r>
           </w:p>
@@ -222,6 +178,7 @@
           </w:tcPr>
           <w:p>
             <w:r>
+              <w:rPr/>
               <w:t>Muhammad Naeem, MBBS, MD</w:t>
             </w:r>
           </w:p>
@@ -249,14 +206,11 @@
               <w:bottom w:w="80" w:type="dxa"/>
               <w:right w:w="120" w:type="dxa"/>
             </w:tcMar>
-            <w:shd w:val="clear" w:color="auto" w:fill="EAF1F8"/>
             <w:vAlign w:val="center"/>
           </w:tcPr>
           <w:p>
             <w:r>
-              <w:rPr>
-                <w:b/>
-              </w:rPr>
+              <w:rPr/>
               <w:t>Study type</w:t>
             </w:r>
           </w:p>
@@ -276,11 +230,11 @@
               <w:bottom w:w="80" w:type="dxa"/>
               <w:right w:w="120" w:type="dxa"/>
             </w:tcMar>
-            <w:shd w:val="clear" w:color="auto" w:fill="EAF1F8"/>
             <w:vAlign w:val="center"/>
           </w:tcPr>
           <w:p>
             <w:r>
+              <w:rPr/>
               <w:t>Prospective, cross-sectional, non-clinical</w:t>
             </w:r>
           </w:p>
@@ -312,9 +266,7 @@
           </w:tcPr>
           <w:p>
             <w:r>
-              <w:rPr>
-                <w:b/>
-              </w:rPr>
+              <w:rPr/>
               <w:t>Requested review level</w:t>
             </w:r>
           </w:p>
@@ -338,6 +290,7 @@
           </w:tcPr>
           <w:p>
             <w:r>
+              <w:rPr/>
               <w:t xml:space="preserve">Exempt determination requested </w:t>
             </w:r>
           </w:p>
@@ -365,14 +318,11 @@
               <w:bottom w:w="80" w:type="dxa"/>
               <w:right w:w="120" w:type="dxa"/>
             </w:tcMar>
-            <w:shd w:val="clear" w:color="auto" w:fill="EAF1F8"/>
             <w:vAlign w:val="center"/>
           </w:tcPr>
           <w:p>
             <w:r>
-              <w:rPr>
-                <w:b/>
-              </w:rPr>
+              <w:rPr/>
               <w:t>Funding</w:t>
             </w:r>
           </w:p>
@@ -392,11 +342,11 @@
               <w:bottom w:w="80" w:type="dxa"/>
               <w:right w:w="120" w:type="dxa"/>
             </w:tcMar>
-            <w:shd w:val="clear" w:color="auto" w:fill="EAF1F8"/>
             <w:vAlign w:val="center"/>
           </w:tcPr>
           <w:p>
             <w:r>
+              <w:rPr/>
               <w:t>None. No industry support.</w:t>
             </w:r>
           </w:p>
@@ -428,9 +378,7 @@
           </w:tcPr>
           <w:p>
             <w:r>
-              <w:rPr>
-                <w:b/>
-              </w:rPr>
+              <w:rPr/>
               <w:t>Study population</w:t>
             </w:r>
           </w:p>
@@ -454,6 +402,7 @@
           </w:tcPr>
           <w:p>
             <w:r>
+              <w:rPr/>
               <w:t>Three adult lay readers, recruited from the general public</w:t>
             </w:r>
           </w:p>
@@ -481,14 +430,11 @@
               <w:bottom w:w="80" w:type="dxa"/>
               <w:right w:w="120" w:type="dxa"/>
             </w:tcMar>
-            <w:shd w:val="clear" w:color="auto" w:fill="EAF1F8"/>
             <w:vAlign w:val="center"/>
           </w:tcPr>
           <w:p>
             <w:r>
-              <w:rPr>
-                <w:b/>
-              </w:rPr>
+              <w:rPr/>
               <w:t>Patient data used</w:t>
             </w:r>
           </w:p>
@@ -508,11 +454,11 @@
               <w:bottom w:w="80" w:type="dxa"/>
               <w:right w:w="120" w:type="dxa"/>
             </w:tcMar>
-            <w:shd w:val="clear" w:color="auto" w:fill="EAF1F8"/>
             <w:vAlign w:val="center"/>
           </w:tcPr>
           <w:p>
             <w:r>
+              <w:rPr/>
               <w:t>None. No protected health information is accessed.</w:t>
             </w:r>
           </w:p>
@@ -544,9 +490,7 @@
           </w:tcPr>
           <w:p>
             <w:r>
-              <w:rPr>
-                <w:b/>
-              </w:rPr>
+              <w:rPr/>
               <w:t>Estimated duration</w:t>
             </w:r>
           </w:p>
@@ -570,9 +514,11 @@
           </w:tcPr>
           <w:p>
             <w:r>
+              <w:rPr/>
               <w:t xml:space="preserve">Approximately </w:t>
             </w:r>
             <w:r>
+              <w:rPr/>
               <w:t>2-3 months</w:t>
             </w:r>
           </w:p>

</xml_diff>